<commit_message>
docs: finalize README and evaluator guidance
</commit_message>
<xml_diff>
--- a/docs/requirements.docx
+++ b/docs/requirements.docx
@@ -73,7 +73,7 @@
           <w:color w:val="5B6978"/>
           <w:sz w:val="19"/>
         </w:rPr>
-        <w:t>Amity University Uttar Pradesh, Lucknow  |  Version 1.0  |  28 July 2026</w:t>
+        <w:t>Amity University Uttar Pradesh, Lucknow  |  Version 1.1  |  28 July 2026</w:t>
       </w:r>
     </w:p>
     <w:tbl>
@@ -13906,7 +13906,7 @@
           <w:color w:val="222D3A"/>
           <w:sz w:val="22"/>
         </w:rPr>
-        <w:t>Leaflet is a candidate open-source browser map library; final dependency version and licence metadata must be reverified during Gate 3 planning and Gate 4 installation.</w:t>
+        <w:t>Leaflet 1.9.4 is the implemented open-source browser map library; its BSD-2-Clause licence and installed version were verified during Gate 4.</w:t>
       </w:r>
     </w:p>
     <w:p>
@@ -14073,7 +14073,7 @@
           <w:color w:val="222D3A"/>
           <w:sz w:val="22"/>
         </w:rPr>
-        <w:t>This specification is the Gate 2 approval candidate. It authorizes requirements only. It does not authorize Git initialization, package installation, application code, GitHub repository creation, pull requests, or deployment.</w:t>
+        <w:t>The user approved this requirements specification at Gate 2 and the implementation plan at Gate 3. The requirements remain the controlling public scope for the locally verified Gate 4 release candidate.</w:t>
       </w:r>
     </w:p>
     <w:p>
@@ -14086,7 +14086,7 @@
           <w:color w:val="222D3A"/>
           <w:sz w:val="22"/>
         </w:rPr>
-        <w:t>After approval, Gate 3 will convert these requirements into the implementation architecture, data flow, state machine, test strategy, deployment strategy, and complete branch/commit/PR checklist.</w:t>
+        <w:t>Production deployment remains separately locked until the user explicitly approves Gate 4. Gate 5 will recheck provider terms, activate the release variable and GitHub Pages workflow, and verify the public URL independently.</w:t>
       </w:r>
     </w:p>
     <w:sectPr>

</xml_diff>

<commit_message>
Harden Gate 4 release candidate (#11)
* docs: record learning accessibility merge

* test: harden release candidate and evidence

* docs: finalize README and evaluator guidance

* fix: resolve release candidate audit findings

* docs: record release browser verification

* docs: record exact release verification

* docs: record release branch publication

* docs: record release branch push

* docs: record release pull request

* docs: record ready release pull request
</commit_message>
<xml_diff>
--- a/docs/requirements.docx
+++ b/docs/requirements.docx
@@ -73,7 +73,7 @@
           <w:color w:val="5B6978"/>
           <w:sz w:val="19"/>
         </w:rPr>
-        <w:t>Amity University Uttar Pradesh, Lucknow  |  Version 1.0  |  28 July 2026</w:t>
+        <w:t>Amity University Uttar Pradesh, Lucknow  |  Version 1.1  |  28 July 2026</w:t>
       </w:r>
     </w:p>
     <w:tbl>
@@ -13906,7 +13906,7 @@
           <w:color w:val="222D3A"/>
           <w:sz w:val="22"/>
         </w:rPr>
-        <w:t>Leaflet is a candidate open-source browser map library; final dependency version and licence metadata must be reverified during Gate 3 planning and Gate 4 installation.</w:t>
+        <w:t>Leaflet 1.9.4 is the implemented open-source browser map library; its BSD-2-Clause licence and installed version were verified during Gate 4.</w:t>
       </w:r>
     </w:p>
     <w:p>
@@ -14073,7 +14073,7 @@
           <w:color w:val="222D3A"/>
           <w:sz w:val="22"/>
         </w:rPr>
-        <w:t>This specification is the Gate 2 approval candidate. It authorizes requirements only. It does not authorize Git initialization, package installation, application code, GitHub repository creation, pull requests, or deployment.</w:t>
+        <w:t>The user approved this requirements specification at Gate 2 and the implementation plan at Gate 3. The requirements remain the controlling public scope for the locally verified Gate 4 release candidate.</w:t>
       </w:r>
     </w:p>
     <w:p>
@@ -14086,7 +14086,7 @@
           <w:color w:val="222D3A"/>
           <w:sz w:val="22"/>
         </w:rPr>
-        <w:t>After approval, Gate 3 will convert these requirements into the implementation architecture, data flow, state machine, test strategy, deployment strategy, and complete branch/commit/PR checklist.</w:t>
+        <w:t>Production deployment remains separately locked until the user explicitly approves Gate 4. Gate 5 will recheck provider terms, activate the release variable and GitHub Pages workflow, and verify the public URL independently.</w:t>
       </w:r>
     </w:p>
     <w:sectPr>

</xml_diff>